<commit_message>
Rewrite Cover Letter: factual, concise, 1-page, no fabricated stories
</commit_message>
<xml_diff>
--- a/Zamir_Jamalov_Cover_Letter_Kontakt_Home.docx
+++ b/Zamir_Jamalov_Cover_Letter_Kontakt_Home.docx
@@ -20,7 +20,7 @@
     </w:p>
     <w:p>
       <w:pPr>
-        <w:spacing w:after="280"/>
+        <w:spacing w:after="300"/>
       </w:pPr>
       <w:r>
         <w:rPr>
@@ -34,7 +34,7 @@
     </w:p>
     <w:p>
       <w:pPr>
-        <w:spacing w:after="280"/>
+        <w:spacing w:after="160" w:line="312"/>
       </w:pPr>
       <w:r>
         <w:rPr>
@@ -48,6 +48,11 @@
     </w:p>
     <w:p>
       <w:pPr>
+        <w:spacing w:after="100"/>
+      </w:pPr>
+    </w:p>
+    <w:p>
+      <w:pPr>
         <w:spacing w:after="160" w:line="312"/>
       </w:pPr>
       <w:r>
@@ -78,7 +83,7 @@
     </w:p>
     <w:p>
       <w:pPr>
-        <w:spacing w:after="280"/>
+        <w:spacing w:after="100"/>
       </w:pPr>
     </w:p>
     <w:p>
@@ -99,7 +104,7 @@
     </w:p>
     <w:p>
       <w:pPr>
-        <w:spacing w:after="160"/>
+        <w:spacing w:after="100"/>
       </w:pPr>
     </w:p>
     <w:p>
@@ -113,7 +118,7 @@
           <w:sz w:val="22"/>
           <w:szCs w:val="22"/>
         </w:rPr>
-        <w:t xml:space="preserve">When I walked into a Kontakt Home store last year and watched a customer spend twenty minutes at the return counter filling out paper forms while a queue grew behind them, I saw something I have spent my entire career solving: a process that desperately needs structure, digitization, and a human-centered redesign. That moment stayed with me, because I knew I had the exact skills to fix it. I am applying for the Business Analyst position at Kontakt Home because I want to turn moments like that into seamless digital experiences.</w:t>
+        <w:t xml:space="preserve">I am applying for the Business Analyst position at Kontakt Home. With two years of focused BA experience in fintech and e-commerce, backed by fifteen years in software engineering across Azerbaijan's banking and public sector, I offer a strong mix of analytical skills and technical depth that fits well with the demands of a large-scale retail technology environment.</w:t>
       </w:r>
     </w:p>
     <w:p>
@@ -127,7 +132,7 @@
           <w:sz w:val="22"/>
           <w:szCs w:val="22"/>
         </w:rPr>
-        <w:t xml:space="preserve">I bring a unique combination to this role. For the past two years at Embafinans, I have been the person who sits between business teams and developers, translating ambitions into working software. I have mapped complex As-Is processes, authored BRDs and FRDs, designed API specifications, coordinated UAT cycles, and resolved stakeholder conflicts with data rather than opinions. Before transitioning to business analysis, I spent fifteen years building systems at the Central Bank of Azerbaijan, Unibank, and ASAN Service. This engineering foundation means I do not just document requirements; I understand the technical reality behind them, which allows me to write specifications that developers actually can build without ambiguity.</w:t>
+        <w:t xml:space="preserve">At Embafinans, I delivered four production systems from requirements discovery through UAT sign-off: a BNPL credit scoring engine that cut decision time by half, a B2C sales channel processing 300 to 500 daily applications, a real-time loan delivery tracking dashboard, and an end-to-end credit lifecycle platform. In each case, my role covered the full spectrum: stakeholder interviews, As-Is/To-Be process mapping, BRD/FRD/SRS authoring, API specification in OpenAPI 3.0, backlog prioritization with RICE, and UAT coordination with business users. Prior to this, at Birbonus I designed a multi-partner loyalty system, which gave me direct experience with the kind of cross-merchant workflows and customer reward logic that retail platforms rely on. My earlier engineering career at the Central Bank of Azerbaijan, Unibank, and ASAN Service means I can evaluate technical feasibility during requirements workshops and write specifications that development teams can implement without ambiguity.</w:t>
       </w:r>
     </w:p>
     <w:p>
@@ -141,7 +146,7 @@
           <w:sz w:val="22"/>
           <w:szCs w:val="22"/>
         </w:rPr>
-        <w:t xml:space="preserve">Kontakt Home is at an inflection point. As Azerbaijan's largest electronics retailer, the company is moving from traditional retail operations toward a digital-first customer experience. That transition requires someone who understands both the retail mindset and the technology landscape. My experience spans fintech (Embafinans, where I digitized credit decision workflows), e-commerce loyalty systems (Birbonus, where I designed multi-partner reward ecosystems), and production systems operations (Umico, where I resolved live incidents). Every one of these experiences taught me how to align technology with real customer needs, which is exactly what Kontakt Home needs as it scales its digital operations.</w:t>
+        <w:t xml:space="preserve">Kontakt Home is Azerbaijan's leading electronics retailer with a significant physical and digital presence. Scaling operations across multiple stores while improving the online customer experience requires disciplined process analysis, clear technical documentation, and someone who can align business goals with delivery teams. My experience in both fintech process digitization and e-commerce platform development maps directly to these needs. I am confident I can add value from day one.</w:t>
       </w:r>
     </w:p>
     <w:p>
@@ -155,48 +160,34 @@
           <w:sz w:val="22"/>
           <w:szCs w:val="22"/>
         </w:rPr>
-        <w:t xml:space="preserve">I am not just looking for a job. I am looking for a place where my work directly impacts thousands of customers every day. Kontakt Home, with its scale, ambition, and commitment to growth, is that place. I would welcome the opportunity to sit down with your team and discuss how I can contribute to building processes and products that your customers and employees will genuinely appreciate.</w:t>
-      </w:r>
-    </w:p>
-    <w:p>
-      <w:pPr>
-        <w:spacing w:after="60"/>
-      </w:pPr>
-    </w:p>
-    <w:p>
-      <w:pPr>
-        <w:spacing w:after="160" w:line="312"/>
-      </w:pPr>
-      <w:r>
-        <w:rPr>
-          <w:rFonts w:ascii="Calibri" w:cs="Calibri" w:eastAsia="Calibri" w:hAnsi="Calibri"/>
+        <w:t xml:space="preserve">I would welcome the opportunity to discuss how my background and skills align with your team's priorities. Thank you for your consideration.</w:t>
+      </w:r>
+    </w:p>
+    <w:p>
+      <w:pPr>
+        <w:spacing w:after="100"/>
+      </w:pPr>
+    </w:p>
+    <w:p>
+      <w:pPr>
+        <w:spacing w:after="160" w:line="312"/>
+      </w:pPr>
+      <w:r>
+        <w:rPr>
+          <w:rFonts w:ascii="Calibri" w:cs="Calibri" w:eastAsia="Calibri" w:hAnsi="Calibri"/>
+          <w:i/>
+          <w:iCs/>
           <w:color w:val="0F2439"/>
           <w:sz w:val="22"/>
           <w:szCs w:val="22"/>
         </w:rPr>
-        <w:t xml:space="preserve">Thank you for your time and consideration.</w:t>
-      </w:r>
-    </w:p>
-    <w:p>
-      <w:pPr>
-        <w:spacing w:after="300"/>
-      </w:pPr>
+        <w:t xml:space="preserve">Yours sincerely,</w:t>
+      </w:r>
     </w:p>
     <w:p>
       <w:pPr>
         <w:spacing w:after="200"/>
       </w:pPr>
-      <w:r>
-        <w:rPr>
-          <w:rFonts w:ascii="Calibri" w:cs="Calibri" w:eastAsia="Calibri" w:hAnsi="Calibri"/>
-          <w:i/>
-          <w:iCs/>
-          <w:color w:val="0F2439"/>
-          <w:sz w:val="22"/>
-          <w:szCs w:val="22"/>
-        </w:rPr>
-        <w:t xml:space="preserve">Yours sincerely,</w:t>
-      </w:r>
     </w:p>
     <w:p>
       <w:pPr>

</xml_diff>

<commit_message>
Rewrite Cover Letter: addressed to HR + Business Development department
</commit_message>
<xml_diff>
--- a/Zamir_Jamalov_Cover_Letter_Kontakt_Home.docx
+++ b/Zamir_Jamalov_Cover_Letter_Kontakt_Home.docx
@@ -62,7 +62,7 @@
           <w:sz w:val="20"/>
           <w:szCs w:val="20"/>
         </w:rPr>
-        <w:t xml:space="preserve">Hiring Manager</w:t>
+        <w:t xml:space="preserve">HR Department</w:t>
       </w:r>
     </w:p>
     <w:p>
@@ -78,13 +78,8 @@
           <w:sz w:val="20"/>
           <w:szCs w:val="20"/>
         </w:rPr>
-        <w:t xml:space="preserve">Kontakt Home</w:t>
-      </w:r>
-    </w:p>
-    <w:p>
-      <w:pPr>
-        <w:spacing w:after="100"/>
-      </w:pPr>
+        <w:t xml:space="preserve">Business Development Directorate</w:t>
+      </w:r>
     </w:p>
     <w:p>
       <w:pPr>
@@ -96,10 +91,10 @@
           <w:b/>
           <w:bCs/>
           <w:color w:val="0F2439"/>
-          <w:sz w:val="22"/>
-          <w:szCs w:val="22"/>
-        </w:rPr>
-        <w:t xml:space="preserve">Dear Hiring Manager,</w:t>
+          <w:sz w:val="20"/>
+          <w:szCs w:val="20"/>
+        </w:rPr>
+        <w:t xml:space="preserve">Kontakt Home</w:t>
       </w:r>
     </w:p>
     <w:p>
@@ -114,53 +109,88 @@
       <w:r>
         <w:rPr>
           <w:rFonts w:ascii="Calibri" w:cs="Calibri" w:eastAsia="Calibri" w:hAnsi="Calibri"/>
-          <w:color w:val="0F2439"/>
-          <w:sz w:val="22"/>
-          <w:szCs w:val="22"/>
-        </w:rPr>
-        <w:t xml:space="preserve">I am applying for the Business Analyst position at Kontakt Home. With two years of focused BA experience in fintech and e-commerce, backed by fifteen years in software engineering across Azerbaijan's banking and public sector, I offer a strong mix of analytical skills and technical depth that fits well with the demands of a large-scale retail technology environment.</w:t>
-      </w:r>
-    </w:p>
-    <w:p>
-      <w:pPr>
-        <w:spacing w:after="160" w:line="312"/>
-      </w:pPr>
-      <w:r>
-        <w:rPr>
-          <w:rFonts w:ascii="Calibri" w:cs="Calibri" w:eastAsia="Calibri" w:hAnsi="Calibri"/>
-          <w:color w:val="0F2439"/>
-          <w:sz w:val="22"/>
-          <w:szCs w:val="22"/>
-        </w:rPr>
-        <w:t xml:space="preserve">At Embafinans, I delivered four production systems from requirements discovery through UAT sign-off: a BNPL credit scoring engine that cut decision time by half, a B2C sales channel processing 300 to 500 daily applications, a real-time loan delivery tracking dashboard, and an end-to-end credit lifecycle platform. In each case, my role covered the full spectrum: stakeholder interviews, As-Is/To-Be process mapping, BRD/FRD/SRS authoring, API specification in OpenAPI 3.0, backlog prioritization with RICE, and UAT coordination with business users. Prior to this, at Birbonus I designed a multi-partner loyalty system, which gave me direct experience with the kind of cross-merchant workflows and customer reward logic that retail platforms rely on. My earlier engineering career at the Central Bank of Azerbaijan, Unibank, and ASAN Service means I can evaluate technical feasibility during requirements workshops and write specifications that development teams can implement without ambiguity.</w:t>
-      </w:r>
-    </w:p>
-    <w:p>
-      <w:pPr>
-        <w:spacing w:after="160" w:line="312"/>
-      </w:pPr>
-      <w:r>
-        <w:rPr>
-          <w:rFonts w:ascii="Calibri" w:cs="Calibri" w:eastAsia="Calibri" w:hAnsi="Calibri"/>
-          <w:color w:val="0F2439"/>
-          <w:sz w:val="22"/>
-          <w:szCs w:val="22"/>
-        </w:rPr>
-        <w:t xml:space="preserve">Kontakt Home is Azerbaijan's leading electronics retailer with a significant physical and digital presence. Scaling operations across multiple stores while improving the online customer experience requires disciplined process analysis, clear technical documentation, and someone who can align business goals with delivery teams. My experience in both fintech process digitization and e-commerce platform development maps directly to these needs. I am confident I can add value from day one.</w:t>
-      </w:r>
-    </w:p>
-    <w:p>
-      <w:pPr>
-        <w:spacing w:after="160" w:line="312"/>
-      </w:pPr>
-      <w:r>
-        <w:rPr>
-          <w:rFonts w:ascii="Calibri" w:cs="Calibri" w:eastAsia="Calibri" w:hAnsi="Calibri"/>
-          <w:color w:val="0F2439"/>
-          <w:sz w:val="22"/>
-          <w:szCs w:val="22"/>
-        </w:rPr>
-        <w:t xml:space="preserve">I would welcome the opportunity to discuss how my background and skills align with your team's priorities. Thank you for your consideration.</w:t>
+          <w:b/>
+          <w:bCs/>
+          <w:color w:val="0F2439"/>
+          <w:sz w:val="22"/>
+          <w:szCs w:val="22"/>
+        </w:rPr>
+        <w:t xml:space="preserve">Dear HR Team,</w:t>
+      </w:r>
+    </w:p>
+    <w:p>
+      <w:pPr>
+        <w:spacing w:after="100"/>
+      </w:pPr>
+    </w:p>
+    <w:p>
+      <w:pPr>
+        <w:spacing w:after="160" w:line="312"/>
+      </w:pPr>
+      <w:r>
+        <w:rPr>
+          <w:rFonts w:ascii="Calibri" w:cs="Calibri" w:eastAsia="Calibri" w:hAnsi="Calibri"/>
+          <w:color w:val="0F2439"/>
+          <w:sz w:val="22"/>
+          <w:szCs w:val="22"/>
+        </w:rPr>
+        <w:t xml:space="preserve">I would like to submit my candidacy for the Business Analyst position within the Business Development department at Kontakt Home. I believe my professional background aligns well with the responsibilities of this role, and I would like to briefly outline why.</w:t>
+      </w:r>
+    </w:p>
+    <w:p>
+      <w:pPr>
+        <w:spacing w:after="160" w:line="312"/>
+      </w:pPr>
+      <w:r>
+        <w:rPr>
+          <w:rFonts w:ascii="Calibri" w:cs="Calibri" w:eastAsia="Calibri" w:hAnsi="Calibri"/>
+          <w:color w:val="0F2439"/>
+          <w:sz w:val="22"/>
+          <w:szCs w:val="22"/>
+        </w:rPr>
+        <w:t xml:space="preserve">A Business Analyst in a Business Development department sits at the intersection of company strategy and operational execution. The role requires understanding business goals, analyzing processes, identifying inefficiencies, proposing solutions, and working with cross-functional teams to implement changes. Over the past two years at Embafinans, this is exactly what I have been doing in practice: conducting stakeholder interviews across risk, sales, and operations departments; mapping As-Is processes and designing To-Be workflows; authoring formal requirements documentation (BRD, FRD, SRS); defining API specifications for development teams; prioritizing work using the RICE framework; and coordinating UAT cycles with business users until sign-off. These are the core deliverables that a Business Development function relies on to make informed decisions and drive projects forward.</w:t>
+      </w:r>
+    </w:p>
+    <w:p>
+      <w:pPr>
+        <w:spacing w:after="160" w:line="312"/>
+      </w:pPr>
+      <w:r>
+        <w:rPr>
+          <w:rFonts w:ascii="Calibri" w:cs="Calibri" w:eastAsia="Calibri" w:hAnsi="Calibri"/>
+          <w:color w:val="0F2439"/>
+          <w:sz w:val="22"/>
+          <w:szCs w:val="22"/>
+        </w:rPr>
+        <w:t xml:space="preserve">The systems I delivered at Embafinans had measurable outcomes: a credit scoring engine that reduced decision time by 50%, a digital sales channel handling 300-500 daily applications, and a real-time delivery tracking dashboard that cut error rates in half. At Birbonus, I designed a customer loyalty system operating across multiple partner merchants, which required defining reward rules, eligibility criteria, and settlement workflows. This experience is directly relevant to a retail context where customer-facing processes, partner coordination, and operational efficiency are daily priorities.</w:t>
+      </w:r>
+    </w:p>
+    <w:p>
+      <w:pPr>
+        <w:spacing w:after="160" w:line="312"/>
+      </w:pPr>
+      <w:r>
+        <w:rPr>
+          <w:rFonts w:ascii="Calibri" w:cs="Calibri" w:eastAsia="Calibri" w:hAnsi="Calibri"/>
+          <w:color w:val="0F2439"/>
+          <w:sz w:val="22"/>
+          <w:szCs w:val="22"/>
+        </w:rPr>
+        <w:t xml:space="preserve">Additionally, my fifteen-year background in software engineering at the Central Bank of Azerbaijan, Unibank, and ASAN Service allows me to evaluate technical feasibility during requirements discussions and produce specifications that development teams can implement without ambiguity. This reduces the communication gap between business and IT, which is a common source of project delays.</w:t>
+      </w:r>
+    </w:p>
+    <w:p>
+      <w:pPr>
+        <w:spacing w:after="160" w:line="312"/>
+      </w:pPr>
+      <w:r>
+        <w:rPr>
+          <w:rFonts w:ascii="Calibri" w:cs="Calibri" w:eastAsia="Calibri" w:hAnsi="Calibri"/>
+          <w:color w:val="0F2439"/>
+          <w:sz w:val="22"/>
+          <w:szCs w:val="22"/>
+        </w:rPr>
+        <w:t xml:space="preserve">I would be glad to discuss my candidacy in more detail at your convenience. Thank you for reviewing my application.</w:t>
       </w:r>
     </w:p>
     <w:p>

</xml_diff>

<commit_message>
Rewrite Cover Letter: professional, 336 words, evidence-based, HR-targeted
</commit_message>
<xml_diff>
--- a/Zamir_Jamalov_Cover_Letter_Kontakt_Home.docx
+++ b/Zamir_Jamalov_Cover_Letter_Kontakt_Home.docx
@@ -59,8 +59,8 @@
         <w:rPr>
           <w:rFonts w:ascii="Calibri" w:cs="Calibri" w:eastAsia="Calibri" w:hAnsi="Calibri"/>
           <w:color w:val="0F2439"/>
-          <w:sz w:val="20"/>
-          <w:szCs w:val="20"/>
+          <w:sz w:val="22"/>
+          <w:szCs w:val="22"/>
         </w:rPr>
         <w:t xml:space="preserve">HR Department</w:t>
       </w:r>
@@ -75,11 +75,16 @@
           <w:b/>
           <w:bCs/>
           <w:color w:val="0F2439"/>
-          <w:sz w:val="20"/>
-          <w:szCs w:val="20"/>
-        </w:rPr>
-        <w:t xml:space="preserve">Business Development Directorate</w:t>
-      </w:r>
+          <w:sz w:val="22"/>
+          <w:szCs w:val="22"/>
+        </w:rPr>
+        <w:t xml:space="preserve">Kontakt Home</w:t>
+      </w:r>
+    </w:p>
+    <w:p>
+      <w:pPr>
+        <w:spacing w:after="100"/>
+      </w:pPr>
     </w:p>
     <w:p>
       <w:pPr>
@@ -91,10 +96,10 @@
           <w:b/>
           <w:bCs/>
           <w:color w:val="0F2439"/>
-          <w:sz w:val="20"/>
-          <w:szCs w:val="20"/>
-        </w:rPr>
-        <w:t xml:space="preserve">Kontakt Home</w:t>
+          <w:sz w:val="22"/>
+          <w:szCs w:val="22"/>
+        </w:rPr>
+        <w:t xml:space="preserve">Dear HR Team,</w:t>
       </w:r>
     </w:p>
     <w:p>
@@ -109,88 +114,53 @@
       <w:r>
         <w:rPr>
           <w:rFonts w:ascii="Calibri" w:cs="Calibri" w:eastAsia="Calibri" w:hAnsi="Calibri"/>
-          <w:b/>
-          <w:bCs/>
-          <w:color w:val="0F2439"/>
-          <w:sz w:val="22"/>
-          <w:szCs w:val="22"/>
-        </w:rPr>
-        <w:t xml:space="preserve">Dear HR Team,</w:t>
-      </w:r>
-    </w:p>
-    <w:p>
-      <w:pPr>
-        <w:spacing w:after="100"/>
-      </w:pPr>
-    </w:p>
-    <w:p>
-      <w:pPr>
-        <w:spacing w:after="160" w:line="312"/>
-      </w:pPr>
-      <w:r>
-        <w:rPr>
-          <w:rFonts w:ascii="Calibri" w:cs="Calibri" w:eastAsia="Calibri" w:hAnsi="Calibri"/>
-          <w:color w:val="0F2439"/>
-          <w:sz w:val="22"/>
-          <w:szCs w:val="22"/>
-        </w:rPr>
-        <w:t xml:space="preserve">I would like to submit my candidacy for the Business Analyst position within the Business Development department at Kontakt Home. I believe my professional background aligns well with the responsibilities of this role, and I would like to briefly outline why.</w:t>
-      </w:r>
-    </w:p>
-    <w:p>
-      <w:pPr>
-        <w:spacing w:after="160" w:line="312"/>
-      </w:pPr>
-      <w:r>
-        <w:rPr>
-          <w:rFonts w:ascii="Calibri" w:cs="Calibri" w:eastAsia="Calibri" w:hAnsi="Calibri"/>
-          <w:color w:val="0F2439"/>
-          <w:sz w:val="22"/>
-          <w:szCs w:val="22"/>
-        </w:rPr>
-        <w:t xml:space="preserve">A Business Analyst in a Business Development department sits at the intersection of company strategy and operational execution. The role requires understanding business goals, analyzing processes, identifying inefficiencies, proposing solutions, and working with cross-functional teams to implement changes. Over the past two years at Embafinans, this is exactly what I have been doing in practice: conducting stakeholder interviews across risk, sales, and operations departments; mapping As-Is processes and designing To-Be workflows; authoring formal requirements documentation (BRD, FRD, SRS); defining API specifications for development teams; prioritizing work using the RICE framework; and coordinating UAT cycles with business users until sign-off. These are the core deliverables that a Business Development function relies on to make informed decisions and drive projects forward.</w:t>
-      </w:r>
-    </w:p>
-    <w:p>
-      <w:pPr>
-        <w:spacing w:after="160" w:line="312"/>
-      </w:pPr>
-      <w:r>
-        <w:rPr>
-          <w:rFonts w:ascii="Calibri" w:cs="Calibri" w:eastAsia="Calibri" w:hAnsi="Calibri"/>
-          <w:color w:val="0F2439"/>
-          <w:sz w:val="22"/>
-          <w:szCs w:val="22"/>
-        </w:rPr>
-        <w:t xml:space="preserve">The systems I delivered at Embafinans had measurable outcomes: a credit scoring engine that reduced decision time by 50%, a digital sales channel handling 300-500 daily applications, and a real-time delivery tracking dashboard that cut error rates in half. At Birbonus, I designed a customer loyalty system operating across multiple partner merchants, which required defining reward rules, eligibility criteria, and settlement workflows. This experience is directly relevant to a retail context where customer-facing processes, partner coordination, and operational efficiency are daily priorities.</w:t>
-      </w:r>
-    </w:p>
-    <w:p>
-      <w:pPr>
-        <w:spacing w:after="160" w:line="312"/>
-      </w:pPr>
-      <w:r>
-        <w:rPr>
-          <w:rFonts w:ascii="Calibri" w:cs="Calibri" w:eastAsia="Calibri" w:hAnsi="Calibri"/>
-          <w:color w:val="0F2439"/>
-          <w:sz w:val="22"/>
-          <w:szCs w:val="22"/>
-        </w:rPr>
-        <w:t xml:space="preserve">Additionally, my fifteen-year background in software engineering at the Central Bank of Azerbaijan, Unibank, and ASAN Service allows me to evaluate technical feasibility during requirements discussions and produce specifications that development teams can implement without ambiguity. This reduces the communication gap between business and IT, which is a common source of project delays.</w:t>
-      </w:r>
-    </w:p>
-    <w:p>
-      <w:pPr>
-        <w:spacing w:after="160" w:line="312"/>
-      </w:pPr>
-      <w:r>
-        <w:rPr>
-          <w:rFonts w:ascii="Calibri" w:cs="Calibri" w:eastAsia="Calibri" w:hAnsi="Calibri"/>
-          <w:color w:val="0F2439"/>
-          <w:sz w:val="22"/>
-          <w:szCs w:val="22"/>
-        </w:rPr>
-        <w:t xml:space="preserve">I would be glad to discuss my candidacy in more detail at your convenience. Thank you for reviewing my application.</w:t>
+          <w:color w:val="0F2439"/>
+          <w:sz w:val="22"/>
+          <w:szCs w:val="22"/>
+        </w:rPr>
+        <w:t xml:space="preserve">As an IT Business Analyst with a track record of delivering four production systems at Embafinans and designing a multi-partner loyalty platform at Birbonus, I am writing to express my interest in the Business Analyst position at Kontakt Home. What draws me to your company is the scale of your operations across physical retail and e-commerce, and the complexity this creates for process optimization, cross-departmental coordination, and technology-driven decision-making. This is the type of challenge my background was built for.</w:t>
+      </w:r>
+    </w:p>
+    <w:p>
+      <w:pPr>
+        <w:spacing w:after="160" w:line="312"/>
+      </w:pPr>
+      <w:r>
+        <w:rPr>
+          <w:rFonts w:ascii="Calibri" w:cs="Calibri" w:eastAsia="Calibri" w:hAnsi="Calibri"/>
+          <w:color w:val="0F2439"/>
+          <w:sz w:val="22"/>
+          <w:szCs w:val="22"/>
+        </w:rPr>
+        <w:t xml:space="preserve">At Embafinans, I was responsible for the full delivery cycle from stakeholder interviews through UAT sign-off. The results were measurable: a BNPL credit scoring engine that reduced decision time by 50%, a digital sales channel processing 300 to 500 daily applications, and a loan delivery tracking dashboard that cut operational errors by half. Each of these required structured process analysis, formal requirements documentation (BRD, FRD, SRS), API specification in OpenAPI 3.0, and backlog prioritization using the RICE framework. At Birbonus, I translated multi-stakeholder business rules into a working loyalty system across partner merchants. These experiences taught me how to operate in environments where business goals, customer experience, and technical constraints must be balanced simultaneously, a dynamic that is central to any large-scale retail operation.</w:t>
+      </w:r>
+    </w:p>
+    <w:p>
+      <w:pPr>
+        <w:spacing w:after="160" w:line="312"/>
+      </w:pPr>
+      <w:r>
+        <w:rPr>
+          <w:rFonts w:ascii="Calibri" w:cs="Calibri" w:eastAsia="Calibri" w:hAnsi="Calibri"/>
+          <w:color w:val="0F2439"/>
+          <w:sz w:val="22"/>
+          <w:szCs w:val="22"/>
+        </w:rPr>
+        <w:t xml:space="preserve">Kontakt Home is not just a retailer; it is a technology-enabled business where every process improvement directly affects customer satisfaction and operational cost. My fifteen-year engineering background at the Central Bank of Azerbaijan, Unibank, and ASAN Service gives me an additional advantage: I can assess technical feasibility during requirements workshops and write specifications that development teams implement without ambiguity. This reduces the cycle from idea to delivery and minimizes the rework that often results from unclear requirements.</w:t>
+      </w:r>
+    </w:p>
+    <w:p>
+      <w:pPr>
+        <w:spacing w:after="160" w:line="312"/>
+      </w:pPr>
+      <w:r>
+        <w:rPr>
+          <w:rFonts w:ascii="Calibri" w:cs="Calibri" w:eastAsia="Calibri" w:hAnsi="Calibri"/>
+          <w:color w:val="0F2439"/>
+          <w:sz w:val="22"/>
+          <w:szCs w:val="22"/>
+        </w:rPr>
+        <w:t xml:space="preserve">I would welcome the opportunity to discuss how my experience can contribute to Kontakt Home. Please find my CV attached for detailed information. Thank you for your time and consideration.</w:t>
       </w:r>
     </w:p>
     <w:p>

</xml_diff>

<commit_message>
Rewrite Cover Letter: aligned with vacancy requirements, risk-free, factual
</commit_message>
<xml_diff>
--- a/Zamir_Jamalov_Cover_Letter_Kontakt_Home.docx
+++ b/Zamir_Jamalov_Cover_Letter_Kontakt_Home.docx
@@ -118,49 +118,49 @@
           <w:sz w:val="22"/>
           <w:szCs w:val="22"/>
         </w:rPr>
-        <w:t xml:space="preserve">As an IT Business Analyst with a track record of delivering four production systems at Embafinans and designing a multi-partner loyalty platform at Birbonus, I am writing to express my interest in the Business Analyst position at Kontakt Home. What draws me to your company is the scale of your operations across physical retail and e-commerce, and the complexity this creates for process optimization, cross-departmental coordination, and technology-driven decision-making. This is the type of challenge my background was built for.</w:t>
-      </w:r>
-    </w:p>
-    <w:p>
-      <w:pPr>
-        <w:spacing w:after="160" w:line="312"/>
-      </w:pPr>
-      <w:r>
-        <w:rPr>
-          <w:rFonts w:ascii="Calibri" w:cs="Calibri" w:eastAsia="Calibri" w:hAnsi="Calibri"/>
-          <w:color w:val="0F2439"/>
-          <w:sz w:val="22"/>
-          <w:szCs w:val="22"/>
-        </w:rPr>
-        <w:t xml:space="preserve">At Embafinans, I was responsible for the full delivery cycle from stakeholder interviews through UAT sign-off. The results were measurable: a BNPL credit scoring engine that reduced decision time by 50%, a digital sales channel processing 300 to 500 daily applications, and a loan delivery tracking dashboard that cut operational errors by half. Each of these required structured process analysis, formal requirements documentation (BRD, FRD, SRS), API specification in OpenAPI 3.0, and backlog prioritization using the RICE framework. At Birbonus, I translated multi-stakeholder business rules into a working loyalty system across partner merchants. These experiences taught me how to operate in environments where business goals, customer experience, and technical constraints must be balanced simultaneously, a dynamic that is central to any large-scale retail operation.</w:t>
-      </w:r>
-    </w:p>
-    <w:p>
-      <w:pPr>
-        <w:spacing w:after="160" w:line="312"/>
-      </w:pPr>
-      <w:r>
-        <w:rPr>
-          <w:rFonts w:ascii="Calibri" w:cs="Calibri" w:eastAsia="Calibri" w:hAnsi="Calibri"/>
-          <w:color w:val="0F2439"/>
-          <w:sz w:val="22"/>
-          <w:szCs w:val="22"/>
-        </w:rPr>
-        <w:t xml:space="preserve">Kontakt Home is not just a retailer; it is a technology-enabled business where every process improvement directly affects customer satisfaction and operational cost. My fifteen-year engineering background at the Central Bank of Azerbaijan, Unibank, and ASAN Service gives me an additional advantage: I can assess technical feasibility during requirements workshops and write specifications that development teams implement without ambiguity. This reduces the cycle from idea to delivery and minimizes the rework that often results from unclear requirements.</w:t>
-      </w:r>
-    </w:p>
-    <w:p>
-      <w:pPr>
-        <w:spacing w:after="160" w:line="312"/>
-      </w:pPr>
-      <w:r>
-        <w:rPr>
-          <w:rFonts w:ascii="Calibri" w:cs="Calibri" w:eastAsia="Calibri" w:hAnsi="Calibri"/>
-          <w:color w:val="0F2439"/>
-          <w:sz w:val="22"/>
-          <w:szCs w:val="22"/>
-        </w:rPr>
-        <w:t xml:space="preserve">I would welcome the opportunity to discuss how my experience can contribute to Kontakt Home. Please find my CV attached for detailed information. Thank you for your time and consideration.</w:t>
+        <w:t xml:space="preserve">I am applying for the Business Analyst (E-Commerce) position at Kontakt Home. Over the past two years at Embafinans, I have been delivering production systems that follow the exact workflow your vacancy describes: gathering business requirements, documenting them in BRD and FRD format, analyzing As-Is processes, designing To-Be models in BPMN, and writing user stories with acceptance criteria through to UAT sign-off. This is the cycle I have repeated across four projects, each with measurable results.</w:t>
+      </w:r>
+    </w:p>
+    <w:p>
+      <w:pPr>
+        <w:spacing w:after="160" w:line="312"/>
+      </w:pPr>
+      <w:r>
+        <w:rPr>
+          <w:rFonts w:ascii="Calibri" w:cs="Calibri" w:eastAsia="Calibri" w:hAnsi="Calibri"/>
+          <w:color w:val="0F2439"/>
+          <w:sz w:val="22"/>
+          <w:szCs w:val="22"/>
+        </w:rPr>
+        <w:t xml:space="preserve">The core of this role, as I understand it, is translating business needs into specifications that development teams can build without ambiguity. At Embafinans, I did precisely that: I defined REST API specifications in OpenAPI 3.0, created sequence and ER diagrams in Confluence, wrote SQL queries to validate data and resolve conflicting stakeholder priorities, and participated in architecture discussions where my engineering background allowed me to evaluate frontend, backend, and database options with the development team. These were not theoretical exercises; the BNPL credit scoring engine I documented reduced decision time by 50%, the digital sales channel I specified now processes 300 to 500 daily applications, and the delivery tracking dashboard I coordinated cut operational errors in half.</w:t>
+      </w:r>
+    </w:p>
+    <w:p>
+      <w:pPr>
+        <w:spacing w:after="160" w:line="312"/>
+      </w:pPr>
+      <w:r>
+        <w:rPr>
+          <w:rFonts w:ascii="Calibri" w:cs="Calibri" w:eastAsia="Calibri" w:hAnsi="Calibri"/>
+          <w:color w:val="0F2439"/>
+          <w:sz w:val="22"/>
+          <w:szCs w:val="22"/>
+        </w:rPr>
+        <w:t xml:space="preserve">Your vacancy also emphasizes collaboration with product, operations, and marketing teams. At Embafinans, my daily work involved coordinating across risk, sales, and operations departments to align requirements. At Birbonus, I designed a loyalty system that required managing requirements from multiple partner merchants simultaneously, defining earning rules, eligibility criteria, and settlement workflows. This experience of balancing diverse stakeholder interests and translating them into structured documentation is directly applicable to an e-commerce environment where product, operations, and marketing priorities frequently intersect.</w:t>
+      </w:r>
+    </w:p>
+    <w:p>
+      <w:pPr>
+        <w:spacing w:after="160" w:line="312"/>
+      </w:pPr>
+      <w:r>
+        <w:rPr>
+          <w:rFonts w:ascii="Calibri" w:cs="Calibri" w:eastAsia="Calibri" w:hAnsi="Calibri"/>
+          <w:color w:val="0F2439"/>
+          <w:sz w:val="22"/>
+          <w:szCs w:val="22"/>
+        </w:rPr>
+        <w:t xml:space="preserve">I would welcome the opportunity to discuss how my skills and experience match your team's needs. Thank you for your consideration.</w:t>
       </w:r>
     </w:p>
     <w:p>

</xml_diff>

<commit_message>
Rewrite Cover Letter: honest fintech-to-ecommerce transition, engineering differentiator
</commit_message>
<xml_diff>
--- a/Zamir_Jamalov_Cover_Letter_Kontakt_Home.docx
+++ b/Zamir_Jamalov_Cover_Letter_Kontakt_Home.docx
@@ -118,49 +118,49 @@
           <w:sz w:val="22"/>
           <w:szCs w:val="22"/>
         </w:rPr>
-        <w:t xml:space="preserve">I am applying for the Business Analyst (E-Commerce) position at Kontakt Home. Over the past two years at Embafinans, I have been delivering production systems that follow the exact workflow your vacancy describes: gathering business requirements, documenting them in BRD and FRD format, analyzing As-Is processes, designing To-Be models in BPMN, and writing user stories with acceptance criteria through to UAT sign-off. This is the cycle I have repeated across four projects, each with measurable results.</w:t>
-      </w:r>
-    </w:p>
-    <w:p>
-      <w:pPr>
-        <w:spacing w:after="160" w:line="312"/>
-      </w:pPr>
-      <w:r>
-        <w:rPr>
-          <w:rFonts w:ascii="Calibri" w:cs="Calibri" w:eastAsia="Calibri" w:hAnsi="Calibri"/>
-          <w:color w:val="0F2439"/>
-          <w:sz w:val="22"/>
-          <w:szCs w:val="22"/>
-        </w:rPr>
-        <w:t xml:space="preserve">The core of this role, as I understand it, is translating business needs into specifications that development teams can build without ambiguity. At Embafinans, I did precisely that: I defined REST API specifications in OpenAPI 3.0, created sequence and ER diagrams in Confluence, wrote SQL queries to validate data and resolve conflicting stakeholder priorities, and participated in architecture discussions where my engineering background allowed me to evaluate frontend, backend, and database options with the development team. These were not theoretical exercises; the BNPL credit scoring engine I documented reduced decision time by 50%, the digital sales channel I specified now processes 300 to 500 daily applications, and the delivery tracking dashboard I coordinated cut operational errors in half.</w:t>
-      </w:r>
-    </w:p>
-    <w:p>
-      <w:pPr>
-        <w:spacing w:after="160" w:line="312"/>
-      </w:pPr>
-      <w:r>
-        <w:rPr>
-          <w:rFonts w:ascii="Calibri" w:cs="Calibri" w:eastAsia="Calibri" w:hAnsi="Calibri"/>
-          <w:color w:val="0F2439"/>
-          <w:sz w:val="22"/>
-          <w:szCs w:val="22"/>
-        </w:rPr>
-        <w:t xml:space="preserve">Your vacancy also emphasizes collaboration with product, operations, and marketing teams. At Embafinans, my daily work involved coordinating across risk, sales, and operations departments to align requirements. At Birbonus, I designed a loyalty system that required managing requirements from multiple partner merchants simultaneously, defining earning rules, eligibility criteria, and settlement workflows. This experience of balancing diverse stakeholder interests and translating them into structured documentation is directly applicable to an e-commerce environment where product, operations, and marketing priorities frequently intersect.</w:t>
-      </w:r>
-    </w:p>
-    <w:p>
-      <w:pPr>
-        <w:spacing w:after="160" w:line="312"/>
-      </w:pPr>
-      <w:r>
-        <w:rPr>
-          <w:rFonts w:ascii="Calibri" w:cs="Calibri" w:eastAsia="Calibri" w:hAnsi="Calibri"/>
-          <w:color w:val="0F2439"/>
-          <w:sz w:val="22"/>
-          <w:szCs w:val="22"/>
-        </w:rPr>
-        <w:t xml:space="preserve">I would welcome the opportunity to discuss how my skills and experience match your team's needs. Thank you for your consideration.</w:t>
+        <w:t xml:space="preserve">I am applying for the Business Analyst (E-Commerce) position at Kontakt Home. My background is in fintech and payment systems, not e-commerce, and I want to be upfront about that. However, the skills your vacancy requires, gathering requirements, mapping As-Is and To-Be processes in BPMN, writing BRDs, FRDs, user stories with acceptance criteria, prioritizing backlogs using RICE, defining REST APIs in OpenAPI 3.0, and coordinating UAT through sign-off, are exactly what I have been doing at Embafinans for the past two years across four production projects. Process digitization is domain-agnostic; the methodology remains the same whether the subject is a credit decision workflow or a return management flow.</w:t>
+      </w:r>
+    </w:p>
+    <w:p>
+      <w:pPr>
+        <w:spacing w:after="160" w:line="312"/>
+      </w:pPr>
+      <w:r>
+        <w:rPr>
+          <w:rFonts w:ascii="Calibri" w:cs="Calibri" w:eastAsia="Calibri" w:hAnsi="Calibri"/>
+          <w:color w:val="0F2439"/>
+          <w:sz w:val="22"/>
+          <w:szCs w:val="22"/>
+        </w:rPr>
+        <w:t xml:space="preserve">What I believe sets me apart from other BA candidates is my fifteen-year prior career in software engineering at the Central Bank of Azerbaijan, Unibank, and ASAN Service. This is not just a line on my CV. It means that when I sit in an architecture discussion, I can evaluate frontend, backend, and database trade-offs alongside the development team rather than relying on them to translate my requirements into technical decisions. At Embafinans, this allowed me to define API specifications that developers implemented without rework, write SQL queries to validate data integrity and resolve stakeholder disagreements with evidence, and create sequence and ER diagrams in Confluence that served as the single source of truth for cross-functional teams. The BNPL credit scoring engine I documented reduced decision time by 50%, the digital sales channel I specified processes 300 to 500 daily applications, and the delivery tracking dashboard I coordinated cut operational errors in half.</w:t>
+      </w:r>
+    </w:p>
+    <w:p>
+      <w:pPr>
+        <w:spacing w:after="160" w:line="312"/>
+      </w:pPr>
+      <w:r>
+        <w:rPr>
+          <w:rFonts w:ascii="Calibri" w:cs="Calibri" w:eastAsia="Calibri" w:hAnsi="Calibri"/>
+          <w:color w:val="0F2439"/>
+          <w:sz w:val="22"/>
+          <w:szCs w:val="22"/>
+        </w:rPr>
+        <w:t xml:space="preserve">My experience at Birbonus is the closest I have to e-commerce. I designed a customer loyalty system that operated across multiple partner merchants, which required defining earning rules, eligibility criteria, and settlement workflows while balancing the interests of different business stakeholders. Managing cross-partner requirements in a platform where customer transactions, merchant operations, and financial settlements intersect is structurally similar to the coordination between product, operations, and marketing teams that your vacancy describes.</w:t>
+      </w:r>
+    </w:p>
+    <w:p>
+      <w:pPr>
+        <w:spacing w:after="160" w:line="312"/>
+      </w:pPr>
+      <w:r>
+        <w:rPr>
+          <w:rFonts w:ascii="Calibri" w:cs="Calibri" w:eastAsia="Calibri" w:hAnsi="Calibri"/>
+          <w:color w:val="0F2439"/>
+          <w:sz w:val="22"/>
+          <w:szCs w:val="22"/>
+        </w:rPr>
+        <w:t xml:space="preserve">I understand that switching from fintech to e-commerce requires learning the specifics of your business, and I am prepared to invest that effort. I would welcome the opportunity to discuss this further. Thank you for your time.</w:t>
       </w:r>
     </w:p>
     <w:p>

</xml_diff>

<commit_message>
Finalize Cover Letter: English, 397 words, 1-page, domain-agnostic strategy
</commit_message>
<xml_diff>
--- a/Zamir_Jamalov_Cover_Letter_Kontakt_Home.docx
+++ b/Zamir_Jamalov_Cover_Letter_Kontakt_Home.docx
@@ -4,16 +4,16 @@
   <w:body>
     <w:p>
       <w:pPr>
-        <w:spacing w:after="20"/>
+        <w:spacing w:after="60"/>
       </w:pPr>
       <w:r>
         <w:rPr>
           <w:rFonts w:ascii="Calibri" w:cs="Calibri" w:eastAsia="Calibri" w:hAnsi="Calibri"/>
           <w:b/>
           <w:bCs/>
-          <w:color w:val="1B3A5C"/>
-          <w:sz w:val="26"/>
-          <w:szCs w:val="26"/>
+          <w:color w:val="1A1A1A"/>
+          <w:sz w:val="28"/>
+          <w:szCs w:val="28"/>
         </w:rPr>
         <w:t xml:space="preserve">Zamir Jamalov</w:t>
       </w:r>
@@ -25,40 +25,36 @@
       <w:r>
         <w:rPr>
           <w:rFonts w:ascii="Calibri" w:cs="Calibri" w:eastAsia="Calibri" w:hAnsi="Calibri"/>
-          <w:color w:val="666666"/>
-          <w:sz w:val="20"/>
-          <w:szCs w:val="20"/>
+          <w:color w:val="555555"/>
+          <w:sz w:val="18"/>
+          <w:szCs w:val="18"/>
         </w:rPr>
         <w:t xml:space="preserve">Baku, Azerbaijan  |  +994 55 207 7228  |  jamalov.zamir@gmail.com</w:t>
       </w:r>
     </w:p>
     <w:p>
       <w:pPr>
-        <w:spacing w:after="160" w:line="312"/>
-      </w:pPr>
-      <w:r>
-        <w:rPr>
-          <w:rFonts w:ascii="Calibri" w:cs="Calibri" w:eastAsia="Calibri" w:hAnsi="Calibri"/>
-          <w:color w:val="666666"/>
-          <w:sz w:val="20"/>
-          <w:szCs w:val="20"/>
-        </w:rPr>
-        <w:t xml:space="preserve">April 26, 2026</w:t>
-      </w:r>
-    </w:p>
-    <w:p>
-      <w:pPr>
-        <w:spacing w:after="100"/>
-      </w:pPr>
-    </w:p>
-    <w:p>
-      <w:pPr>
-        <w:spacing w:after="160" w:line="312"/>
-      </w:pPr>
-      <w:r>
-        <w:rPr>
-          <w:rFonts w:ascii="Calibri" w:cs="Calibri" w:eastAsia="Calibri" w:hAnsi="Calibri"/>
-          <w:color w:val="0F2439"/>
+        <w:spacing w:after="200"/>
+        <w:jc w:val="right"/>
+      </w:pPr>
+      <w:r>
+        <w:rPr>
+          <w:rFonts w:ascii="Calibri" w:cs="Calibri" w:eastAsia="Calibri" w:hAnsi="Calibri"/>
+          <w:color w:val="2C2C2C"/>
+          <w:sz w:val="22"/>
+          <w:szCs w:val="22"/>
+        </w:rPr>
+        <w:t xml:space="preserve">April 27, 2026</w:t>
+      </w:r>
+    </w:p>
+    <w:p>
+      <w:pPr>
+        <w:spacing w:after="60"/>
+      </w:pPr>
+      <w:r>
+        <w:rPr>
+          <w:rFonts w:ascii="Calibri" w:cs="Calibri" w:eastAsia="Calibri" w:hAnsi="Calibri"/>
+          <w:color w:val="2C2C2C"/>
           <w:sz w:val="22"/>
           <w:szCs w:val="22"/>
         </w:rPr>
@@ -67,147 +63,127 @@
     </w:p>
     <w:p>
       <w:pPr>
-        <w:spacing w:after="160" w:line="312"/>
+        <w:spacing w:after="200"/>
+      </w:pPr>
+      <w:r>
+        <w:rPr>
+          <w:rFonts w:ascii="Calibri" w:cs="Calibri" w:eastAsia="Calibri" w:hAnsi="Calibri"/>
+          <w:color w:val="2C2C2C"/>
+          <w:sz w:val="22"/>
+          <w:szCs w:val="22"/>
+        </w:rPr>
+        <w:t xml:space="preserve">Kontakt Home</w:t>
+      </w:r>
+    </w:p>
+    <w:p>
+      <w:pPr>
+        <w:spacing w:after="200"/>
+      </w:pPr>
+      <w:r>
+        <w:rPr>
+          <w:rFonts w:ascii="Calibri" w:cs="Calibri" w:eastAsia="Calibri" w:hAnsi="Calibri"/>
+          <w:color w:val="2C2C2C"/>
+          <w:sz w:val="22"/>
+          <w:szCs w:val="22"/>
+        </w:rPr>
+        <w:t xml:space="preserve">Dear HR Team,</w:t>
+      </w:r>
+    </w:p>
+    <w:p>
+      <w:pPr>
+        <w:spacing w:after="200" w:line="276"/>
+        <w:jc w:val="both"/>
+      </w:pPr>
+      <w:r>
+        <w:rPr>
+          <w:rFonts w:ascii="Calibri" w:cs="Calibri" w:eastAsia="Calibri" w:hAnsi="Calibri"/>
+          <w:color w:val="2C2C2C"/>
+          <w:sz w:val="22"/>
+          <w:szCs w:val="22"/>
+        </w:rPr>
+        <w:t xml:space="preserve">I am applying for the Business Analyst (E-Commerce) position at Kontakt Home. My background is in fintech and payment systems, not e-commerce, and I want to be upfront about that. However, the skills your vacancy requires — gathering requirements, mapping As-Is and To-Be processes in BPMN, writing BRDs, FRDs, user stories with acceptance criteria, prioritizing backlogs using RICE, defining REST APIs in OpenAPI 3.0, and coordinating UAT through sign-off — are exactly what I have been doing at Embafinans for the past two years across four production projects. Process digitization is domain-agnostic; the methodology remains the same whether the subject is a credit decision workflow or a return management flow.</w:t>
+      </w:r>
+    </w:p>
+    <w:p>
+      <w:pPr>
+        <w:spacing w:after="200" w:line="276"/>
+        <w:jc w:val="both"/>
+      </w:pPr>
+      <w:r>
+        <w:rPr>
+          <w:rFonts w:ascii="Calibri" w:cs="Calibri" w:eastAsia="Calibri" w:hAnsi="Calibri"/>
+          <w:color w:val="2C2C2C"/>
+          <w:sz w:val="22"/>
+          <w:szCs w:val="22"/>
+        </w:rPr>
+        <w:t xml:space="preserve">What I believe sets me apart from other BA candidates is my fifteen-year prior career in software engineering at the Central Bank of Azerbaijan, Unibank, and ASAN Service. This is not just a line on my CV. It means that when I sit in an architecture discussion, I can evaluate frontend, backend, and database trade-offs alongside the development team rather than relying on them to translate my requirements into technical decisions. At Embafinans, this allowed me to define API specifications that developers implemented without rework, write SQL queries to validate data integrity and resolve stakeholder disagreements with evidence, and create sequence and ER diagrams in Confluence that served as the single source of truth for cross-functional teams. The BNPL credit scoring engine I documented reduced decision time by 50%, the digital sales channel I specified processes 300 to 500 daily applications, and the delivery tracking dashboard I coordinated cut operational errors in half.</w:t>
+      </w:r>
+    </w:p>
+    <w:p>
+      <w:pPr>
+        <w:spacing w:after="200" w:line="276"/>
+        <w:jc w:val="both"/>
+      </w:pPr>
+      <w:r>
+        <w:rPr>
+          <w:rFonts w:ascii="Calibri" w:cs="Calibri" w:eastAsia="Calibri" w:hAnsi="Calibri"/>
+          <w:color w:val="2C2C2C"/>
+          <w:sz w:val="22"/>
+          <w:szCs w:val="22"/>
+        </w:rPr>
+        <w:t xml:space="preserve">My experience at Birbonus is the closest I have to e-commerce. I designed a customer loyalty system that operated across multiple partner merchants, which required defining earning rules, eligibility criteria, and settlement workflows while balancing the interests of different business stakeholders. Managing cross-partner requirements in a platform where customer transactions, merchant operations, and financial settlements intersect is structurally similar to the coordination between product, operations, and marketing teams that your vacancy describes.</w:t>
+      </w:r>
+    </w:p>
+    <w:p>
+      <w:pPr>
+        <w:spacing w:after="300" w:line="276"/>
+        <w:jc w:val="both"/>
+      </w:pPr>
+      <w:r>
+        <w:rPr>
+          <w:rFonts w:ascii="Calibri" w:cs="Calibri" w:eastAsia="Calibri" w:hAnsi="Calibri"/>
+          <w:color w:val="2C2C2C"/>
+          <w:sz w:val="22"/>
+          <w:szCs w:val="22"/>
+        </w:rPr>
+        <w:t xml:space="preserve">I understand that switching from fintech to e-commerce requires learning the specifics of your business, and I am prepared to invest that effort. I would welcome the opportunity to discuss this further. Thank you for your time.</w:t>
+      </w:r>
+    </w:p>
+    <w:p>
+      <w:pPr>
+        <w:spacing w:after="60"/>
+        <w:jc w:val="right"/>
+      </w:pPr>
+      <w:r>
+        <w:rPr>
+          <w:rFonts w:ascii="Calibri" w:cs="Calibri" w:eastAsia="Calibri" w:hAnsi="Calibri"/>
+          <w:color w:val="2C2C2C"/>
+          <w:sz w:val="22"/>
+          <w:szCs w:val="22"/>
+        </w:rPr>
+        <w:t xml:space="preserve">Yours sincerely,</w:t>
+      </w:r>
+    </w:p>
+    <w:p>
+      <w:pPr>
+        <w:spacing w:after="0"/>
+        <w:jc w:val="right"/>
       </w:pPr>
       <w:r>
         <w:rPr>
           <w:rFonts w:ascii="Calibri" w:cs="Calibri" w:eastAsia="Calibri" w:hAnsi="Calibri"/>
           <w:b/>
           <w:bCs/>
-          <w:color w:val="0F2439"/>
-          <w:sz w:val="22"/>
-          <w:szCs w:val="22"/>
-        </w:rPr>
-        <w:t xml:space="preserve">Kontakt Home</w:t>
-      </w:r>
-    </w:p>
-    <w:p>
-      <w:pPr>
-        <w:spacing w:after="100"/>
-      </w:pPr>
-    </w:p>
-    <w:p>
-      <w:pPr>
-        <w:spacing w:after="160" w:line="312"/>
-      </w:pPr>
-      <w:r>
-        <w:rPr>
-          <w:rFonts w:ascii="Calibri" w:cs="Calibri" w:eastAsia="Calibri" w:hAnsi="Calibri"/>
-          <w:b/>
-          <w:bCs/>
-          <w:color w:val="0F2439"/>
-          <w:sz w:val="22"/>
-          <w:szCs w:val="22"/>
-        </w:rPr>
-        <w:t xml:space="preserve">Dear HR Team,</w:t>
-      </w:r>
-    </w:p>
-    <w:p>
-      <w:pPr>
-        <w:spacing w:after="100"/>
-      </w:pPr>
-    </w:p>
-    <w:p>
-      <w:pPr>
-        <w:spacing w:after="160" w:line="312"/>
-      </w:pPr>
-      <w:r>
-        <w:rPr>
-          <w:rFonts w:ascii="Calibri" w:cs="Calibri" w:eastAsia="Calibri" w:hAnsi="Calibri"/>
-          <w:color w:val="0F2439"/>
-          <w:sz w:val="22"/>
-          <w:szCs w:val="22"/>
-        </w:rPr>
-        <w:t xml:space="preserve">I am applying for the Business Analyst (E-Commerce) position at Kontakt Home. My background is in fintech and payment systems, not e-commerce, and I want to be upfront about that. However, the skills your vacancy requires, gathering requirements, mapping As-Is and To-Be processes in BPMN, writing BRDs, FRDs, user stories with acceptance criteria, prioritizing backlogs using RICE, defining REST APIs in OpenAPI 3.0, and coordinating UAT through sign-off, are exactly what I have been doing at Embafinans for the past two years across four production projects. Process digitization is domain-agnostic; the methodology remains the same whether the subject is a credit decision workflow or a return management flow.</w:t>
-      </w:r>
-    </w:p>
-    <w:p>
-      <w:pPr>
-        <w:spacing w:after="160" w:line="312"/>
-      </w:pPr>
-      <w:r>
-        <w:rPr>
-          <w:rFonts w:ascii="Calibri" w:cs="Calibri" w:eastAsia="Calibri" w:hAnsi="Calibri"/>
-          <w:color w:val="0F2439"/>
-          <w:sz w:val="22"/>
-          <w:szCs w:val="22"/>
-        </w:rPr>
-        <w:t xml:space="preserve">What I believe sets me apart from other BA candidates is my fifteen-year prior career in software engineering at the Central Bank of Azerbaijan, Unibank, and ASAN Service. This is not just a line on my CV. It means that when I sit in an architecture discussion, I can evaluate frontend, backend, and database trade-offs alongside the development team rather than relying on them to translate my requirements into technical decisions. At Embafinans, this allowed me to define API specifications that developers implemented without rework, write SQL queries to validate data integrity and resolve stakeholder disagreements with evidence, and create sequence and ER diagrams in Confluence that served as the single source of truth for cross-functional teams. The BNPL credit scoring engine I documented reduced decision time by 50%, the digital sales channel I specified processes 300 to 500 daily applications, and the delivery tracking dashboard I coordinated cut operational errors in half.</w:t>
-      </w:r>
-    </w:p>
-    <w:p>
-      <w:pPr>
-        <w:spacing w:after="160" w:line="312"/>
-      </w:pPr>
-      <w:r>
-        <w:rPr>
-          <w:rFonts w:ascii="Calibri" w:cs="Calibri" w:eastAsia="Calibri" w:hAnsi="Calibri"/>
-          <w:color w:val="0F2439"/>
-          <w:sz w:val="22"/>
-          <w:szCs w:val="22"/>
-        </w:rPr>
-        <w:t xml:space="preserve">My experience at Birbonus is the closest I have to e-commerce. I designed a customer loyalty system that operated across multiple partner merchants, which required defining earning rules, eligibility criteria, and settlement workflows while balancing the interests of different business stakeholders. Managing cross-partner requirements in a platform where customer transactions, merchant operations, and financial settlements intersect is structurally similar to the coordination between product, operations, and marketing teams that your vacancy describes.</w:t>
-      </w:r>
-    </w:p>
-    <w:p>
-      <w:pPr>
-        <w:spacing w:after="160" w:line="312"/>
-      </w:pPr>
-      <w:r>
-        <w:rPr>
-          <w:rFonts w:ascii="Calibri" w:cs="Calibri" w:eastAsia="Calibri" w:hAnsi="Calibri"/>
-          <w:color w:val="0F2439"/>
-          <w:sz w:val="22"/>
-          <w:szCs w:val="22"/>
-        </w:rPr>
-        <w:t xml:space="preserve">I understand that switching from fintech to e-commerce requires learning the specifics of your business, and I am prepared to invest that effort. I would welcome the opportunity to discuss this further. Thank you for your time.</w:t>
-      </w:r>
-    </w:p>
-    <w:p>
-      <w:pPr>
-        <w:spacing w:after="100"/>
-      </w:pPr>
-    </w:p>
-    <w:p>
-      <w:pPr>
-        <w:spacing w:after="160" w:line="312"/>
-      </w:pPr>
-      <w:r>
-        <w:rPr>
-          <w:rFonts w:ascii="Calibri" w:cs="Calibri" w:eastAsia="Calibri" w:hAnsi="Calibri"/>
-          <w:i/>
-          <w:iCs/>
-          <w:color w:val="0F2439"/>
-          <w:sz w:val="22"/>
-          <w:szCs w:val="22"/>
-        </w:rPr>
-        <w:t xml:space="preserve">Yours sincerely,</w:t>
-      </w:r>
-    </w:p>
-    <w:p>
-      <w:pPr>
-        <w:spacing w:after="200"/>
-      </w:pPr>
-    </w:p>
-    <w:p>
-      <w:pPr>
-        <w:spacing w:after="20"/>
-      </w:pPr>
-      <w:r>
-        <w:rPr>
-          <w:rFonts w:ascii="Calibri" w:cs="Calibri" w:eastAsia="Calibri" w:hAnsi="Calibri"/>
-          <w:b/>
-          <w:bCs/>
-          <w:color w:val="1B3A5C"/>
-          <w:sz w:val="24"/>
-          <w:szCs w:val="24"/>
+          <w:color w:val="1A1A1A"/>
+          <w:sz w:val="22"/>
+          <w:szCs w:val="22"/>
         </w:rPr>
         <w:t xml:space="preserve">Zamir Jamalov</w:t>
       </w:r>
     </w:p>
     <w:sectPr>
       <w:pgSz w:w="11906" w:h="16838" w:orient="portrait"/>
-      <w:pgMar w:top="1080" w:right="1260" w:bottom="1080" w:left="1260" w:header="708" w:footer="708" w:gutter="0"/>
+      <w:pgMar w:top="1200" w:right="1500" w:bottom="1200" w:left="1500" w:header="708" w:footer="708" w:gutter="0"/>
       <w:pgNumType/>
       <w:docGrid w:linePitch="360"/>
     </w:sectPr>
@@ -391,8 +367,19 @@
 <file path=word/styles.xml><?xml version="1.0" encoding="utf-8"?>
 <w:styles xmlns:mc="http://schemas.openxmlformats.org/markup-compatibility/2006" xmlns:r="http://schemas.openxmlformats.org/officeDocument/2006/relationships" xmlns:w="http://schemas.openxmlformats.org/wordprocessingml/2006/main" xmlns:w14="http://schemas.microsoft.com/office/word/2010/wordml" xmlns:w15="http://schemas.microsoft.com/office/word/2012/wordml" mc:Ignorable="w14 w15">
   <w:docDefaults>
-    <w:rPrDefault/>
-    <w:pPrDefault/>
+    <w:rPrDefault>
+      <w:rPr>
+        <w:rFonts w:ascii="Calibri" w:eastAsia="Calibri"/>
+        <w:color w:val="2C2C2C"/>
+        <w:sz w:val="22"/>
+        <w:szCs w:val="22"/>
+      </w:rPr>
+    </w:rPrDefault>
+    <w:pPrDefault>
+      <w:pPr>
+        <w:spacing w:line="276"/>
+      </w:pPr>
+    </w:pPrDefault>
   </w:docDefaults>
   <w:style w:type="paragraph" w:styleId="Title">
     <w:name w:val="Title"/>

</xml_diff>

<commit_message>
V6 Cover Letter: 266 words, short format, half-A4, Why Kontakt Home added
</commit_message>
<xml_diff>
--- a/Zamir_Jamalov_Cover_Letter_Kontakt_Home.docx
+++ b/Zamir_Jamalov_Cover_Letter_Kontakt_Home.docx
@@ -101,7 +101,7 @@
           <w:sz w:val="22"/>
           <w:szCs w:val="22"/>
         </w:rPr>
-        <w:t xml:space="preserve">I am applying for the Business Analyst (E-Commerce) position at Kontakt Home. My background is in fintech and payment systems, not e-commerce, and I want to be upfront about that. However, the skills your vacancy requires — gathering requirements, mapping As-Is and To-Be processes in BPMN, writing BRDs, FRDs, user stories with acceptance criteria, prioritizing backlogs using RICE, defining REST APIs in OpenAPI 3.0, and coordinating UAT through sign-off — are exactly what I have been doing at Embafinans for the past two years across four production projects. Process digitization is domain-agnostic; the methodology remains the same whether the subject is a credit decision workflow or a return management flow.</w:t>
+        <w:t xml:space="preserve">I am applying for the Business Analyst (E-Commerce) position at Kontakt Home. As Azerbaijan's leading home appliance retailer, Kontakt Home is at an exciting stage where digital transformation directly impacts customer experience and operational efficiency — and that is exactly where I want to contribute.</w:t>
       </w:r>
     </w:p>
     <w:p>
@@ -116,7 +116,7 @@
           <w:sz w:val="22"/>
           <w:szCs w:val="22"/>
         </w:rPr>
-        <w:t xml:space="preserve">What I believe sets me apart from other BA candidates is my fifteen-year prior career in software engineering at the Central Bank of Azerbaijan, Unibank, and ASAN Service. This is not just a line on my CV. It means that when I sit in an architecture discussion, I can evaluate frontend, backend, and database trade-offs alongside the development team rather than relying on them to translate my requirements into technical decisions. At Embafinans, this allowed me to define API specifications that developers implemented without rework, write SQL queries to validate data integrity and resolve stakeholder disagreements with evidence, and create sequence and ER diagrams in Confluence that served as the single source of truth for cross-functional teams. The BNPL credit scoring engine I documented reduced decision time by 50%, the digital sales channel I specified processes 300 to 500 daily applications, and the delivery tracking dashboard I coordinated cut operational errors in half.</w:t>
+        <w:t xml:space="preserve">My background is in fintech, not e-commerce, and I want to be upfront about that. However, the core BA skills your vacancy requires — BRD, FRD, BPMN process mapping, RICE backlog prioritization, REST API specification in OpenAPI 3.0, and UAT coordination — are the same tools I have used to deliver four production systems at Embafinans. Process digitization is domain-agnostic; the methodology does not change whether the process is a credit decision or a return management flow.</w:t>
       </w:r>
     </w:p>
     <w:p>
@@ -131,7 +131,7 @@
           <w:sz w:val="22"/>
           <w:szCs w:val="22"/>
         </w:rPr>
-        <w:t xml:space="preserve">My experience at Birbonus is the closest I have to e-commerce. I designed a customer loyalty system that operated across multiple partner merchants, which required defining earning rules, eligibility criteria, and settlement workflows while balancing the interests of different business stakeholders. Managing cross-partner requirements in a platform where customer transactions, merchant operations, and financial settlements intersect is structurally similar to the coordination between product, operations, and marketing teams that your vacancy describes.</w:t>
+        <w:t xml:space="preserve">What sets me apart is my fifteen years in software engineering before becoming a BA. This means I can evaluate technical trade-offs alongside developers, write SQL to validate data integrity, and define APIs that require zero rework. Concrete results: the credit scoring engine I documented reduced decision time by 50%, the digital sales channel I specified processes 300–500 daily applications, and the delivery tracking dashboard I coordinated cut operational errors by half. My loyalty platform experience at Birbonus — managing cross-partner requirements across merchants, transactions, and settlements — is structurally close to the multi-stakeholder coordination that e-commerce demands.</w:t>
       </w:r>
     </w:p>
     <w:p>
@@ -146,7 +146,7 @@
           <w:sz w:val="22"/>
           <w:szCs w:val="22"/>
         </w:rPr>
-        <w:t xml:space="preserve">I understand that switching from fintech to e-commerce requires learning the specifics of your business, and I am prepared to invest that effort. I would welcome the opportunity to discuss this further. Thank you for your time.</w:t>
+        <w:t xml:space="preserve">I would welcome the opportunity to discuss how I can contribute to Kontakt Home's digital goals. Thank you for your time.</w:t>
       </w:r>
     </w:p>
     <w:p>
@@ -166,7 +166,6 @@
     </w:p>
     <w:p>
       <w:pPr>
-        <w:spacing w:after="0"/>
         <w:jc w:val="right"/>
       </w:pPr>
       <w:r>

</xml_diff>

<commit_message>
V7 Cover Letter: B1 English, no CV repetition, no boasting, simple and clear
</commit_message>
<xml_diff>
--- a/Zamir_Jamalov_Cover_Letter_Kontakt_Home.docx
+++ b/Zamir_Jamalov_Cover_Letter_Kontakt_Home.docx
@@ -101,7 +101,7 @@
           <w:sz w:val="22"/>
           <w:szCs w:val="22"/>
         </w:rPr>
-        <w:t xml:space="preserve">I am applying for the Business Analyst (E-Commerce) position at Kontakt Home. As Azerbaijan's leading home appliance retailer, Kontakt Home is at an exciting stage where digital transformation directly impacts customer experience and operational efficiency — and that is exactly where I want to contribute.</w:t>
+        <w:t xml:space="preserve">I am applying for the Business Analyst (E-Commerce) position at Kontakt Home. As the leading home appliance retailer in Azerbaijan, Kontakt Home is growing fast in digital, and I would like to be part of that growth.</w:t>
       </w:r>
     </w:p>
     <w:p>
@@ -116,7 +116,7 @@
           <w:sz w:val="22"/>
           <w:szCs w:val="22"/>
         </w:rPr>
-        <w:t xml:space="preserve">My background is in fintech, not e-commerce, and I want to be upfront about that. However, the core BA skills your vacancy requires — BRD, FRD, BPMN process mapping, RICE backlog prioritization, REST API specification in OpenAPI 3.0, and UAT coordination — are the same tools I have used to deliver four production systems at Embafinans. Process digitization is domain-agnostic; the methodology does not change whether the process is a credit decision or a return management flow.</w:t>
+        <w:t xml:space="preserve">My background is in fintech, not e-commerce, and I want to be honest about that. But the job of a Business Analyst is to understand business needs and turn them into clear documents for developers, and that is exactly what I have been doing for two years at Embafinans across four real projects. The way of working does not change from one industry to another.</w:t>
       </w:r>
     </w:p>
     <w:p>
@@ -131,7 +131,7 @@
           <w:sz w:val="22"/>
           <w:szCs w:val="22"/>
         </w:rPr>
-        <w:t xml:space="preserve">What sets me apart is my fifteen years in software engineering before becoming a BA. This means I can evaluate technical trade-offs alongside developers, write SQL to validate data integrity, and define APIs that require zero rework. Concrete results: the credit scoring engine I documented reduced decision time by 50%, the digital sales channel I specified processes 300–500 daily applications, and the delivery tracking dashboard I coordinated cut operational errors by half. My loyalty platform experience at Birbonus — managing cross-partner requirements across merchants, transactions, and settlements — is structurally close to the multi-stakeholder coordination that e-commerce demands.</w:t>
+        <w:t xml:space="preserve">Before becoming a BA, I worked as a software engineer for fifteen years at the Central Bank of Azerbaijan, Unibank, and ASAN Service. This background helps me write requirements that developers understand without extra questions. Some results from my work: one system became 50% faster after my documentation, another one handles 300 to 500 requests every day, and a third one cut mistakes by half. Also, at Birbonus I worked with many partner companies at the same time, and I believe this is very similar to e-commerce, where product, operations, and marketing teams need to work together closely.</w:t>
       </w:r>
     </w:p>
     <w:p>
@@ -146,7 +146,7 @@
           <w:sz w:val="22"/>
           <w:szCs w:val="22"/>
         </w:rPr>
-        <w:t xml:space="preserve">I would welcome the opportunity to discuss how I can contribute to Kontakt Home's digital goals. Thank you for your time.</w:t>
+        <w:t xml:space="preserve">I would be happy to talk about how I can help Kontakt Home. Thank you for your time.</w:t>
       </w:r>
     </w:p>
     <w:p>

</xml_diff>

<commit_message>
V8 Cover Letter: no company names, 1 year, softer tone, results at Embafinans
</commit_message>
<xml_diff>
--- a/Zamir_Jamalov_Cover_Letter_Kontakt_Home.docx
+++ b/Zamir_Jamalov_Cover_Letter_Kontakt_Home.docx
@@ -116,7 +116,7 @@
           <w:sz w:val="22"/>
           <w:szCs w:val="22"/>
         </w:rPr>
-        <w:t xml:space="preserve">My background is in fintech, not e-commerce, and I want to be honest about that. But the job of a Business Analyst is to understand business needs and turn them into clear documents for developers, and that is exactly what I have been doing for two years at Embafinans across four real projects. The way of working does not change from one industry to another.</w:t>
+        <w:t xml:space="preserve">The job of a Business Analyst is to understand business needs and turn them into clear documents for developers, and that is exactly what I have been doing for one year at Embafinans across four real projects. I believe these skills can be useful in any industry, including e-commerce.</w:t>
       </w:r>
     </w:p>
     <w:p>
@@ -131,7 +131,7 @@
           <w:sz w:val="22"/>
           <w:szCs w:val="22"/>
         </w:rPr>
-        <w:t xml:space="preserve">Before becoming a BA, I worked as a software engineer for fifteen years at the Central Bank of Azerbaijan, Unibank, and ASAN Service. This background helps me write requirements that developers understand without extra questions. Some results from my work: one system became 50% faster after my documentation, another one handles 300 to 500 requests every day, and a third one cut mistakes by half. Also, at Birbonus I worked with many partner companies at the same time, and I believe this is very similar to e-commerce, where product, operations, and marketing teams need to work together closely.</w:t>
+        <w:t xml:space="preserve">Before becoming a BA, I worked as a software engineer for fifteen years in the banking and government sectors. This background helps me write requirements that developers understand without extra questions. At Embafinans, I reached some concrete results: one system became 50% faster after my documentation, another one handles 300 to 500 requests every day, and a third one cut mistakes by half. Also, at Birbonus I worked with many partner companies at the same time, and I believe this is very similar to e-commerce, where product, operations, and marketing teams need to work together closely.</w:t>
       </w:r>
     </w:p>
     <w:p>

</xml_diff>

<commit_message>
V9 Cover Letter: project names, payment gateway, omnichannel, no 15yr, specific Why Kontakt Home
</commit_message>
<xml_diff>
--- a/Zamir_Jamalov_Cover_Letter_Kontakt_Home.docx
+++ b/Zamir_Jamalov_Cover_Letter_Kontakt_Home.docx
@@ -101,7 +101,7 @@
           <w:sz w:val="22"/>
           <w:szCs w:val="22"/>
         </w:rPr>
-        <w:t xml:space="preserve">I am applying for the Business Analyst (E-Commerce) position at Kontakt Home. As the leading home appliance retailer in Azerbaijan, Kontakt Home is growing fast in digital, and I would like to be part of that growth.</w:t>
+        <w:t xml:space="preserve">I am applying for the Business Analyst (E-Commerce) position at Kontakt Home. The way you are growing your online sales and connecting the store experience with digital channels makes this role very interesting to me.</w:t>
       </w:r>
     </w:p>
     <w:p>
@@ -116,7 +116,7 @@
           <w:sz w:val="22"/>
           <w:szCs w:val="22"/>
         </w:rPr>
-        <w:t xml:space="preserve">The job of a Business Analyst is to understand business needs and turn them into clear documents for developers, and that is exactly what I have been doing for one year at Embafinans across four real projects. I believe these skills can be useful in any industry, including e-commerce.</w:t>
+        <w:t xml:space="preserve">For the past year at Embafinans, I have been working as a Business Analyst, turning business needs into clear requirements for developers. In my previous banking experience, I also worked with payment gateways and omnichannel solutions, where customers could start a process on one channel and continue on another. These experiences are directly connected to e-commerce.</w:t>
       </w:r>
     </w:p>
     <w:p>
@@ -131,7 +131,7 @@
           <w:sz w:val="22"/>
           <w:szCs w:val="22"/>
         </w:rPr>
-        <w:t xml:space="preserve">Before becoming a BA, I worked as a software engineer for fifteen years in the banking and government sectors. This background helps me write requirements that developers understand without extra questions. At Embafinans, I reached some concrete results: one system became 50% faster after my documentation, another one handles 300 to 500 requests every day, and a third one cut mistakes by half. Also, at Birbonus I worked with many partner companies at the same time, and I believe this is very similar to e-commerce, where product, operations, and marketing teams need to work together closely.</w:t>
+        <w:t xml:space="preserve">My software engineering background helps me write requirements that developers understand without extra questions. At Embafinans, I reached concrete results: the credit scoring system I documented became 50% faster, the digital sales channel I specified handles 300 to 500 applications every day, and the delivery tracking dashboard I coordinated cut mistakes by half. At Birbonus, I managed requirements for many partner companies where customers, merchants, and payments all had to work together, and this is the same kind of coordination that e-commerce needs.</w:t>
       </w:r>
     </w:p>
     <w:p>

</xml_diff>

<commit_message>
V10 Cover Letter: Birbonus payment/refund, GPP+MobilBank, omnichannel+payment gateway, contextual results
</commit_message>
<xml_diff>
--- a/Zamir_Jamalov_Cover_Letter_Kontakt_Home.docx
+++ b/Zamir_Jamalov_Cover_Letter_Kontakt_Home.docx
@@ -116,7 +116,7 @@
           <w:sz w:val="22"/>
           <w:szCs w:val="22"/>
         </w:rPr>
-        <w:t xml:space="preserve">For the past year at Embafinans, I have been working as a Business Analyst, turning business needs into clear requirements for developers. In my previous banking experience, I also worked with payment gateways and omnichannel solutions, where customers could start a process on one channel and continue on another. These experiences are directly connected to e-commerce.</w:t>
+        <w:t xml:space="preserve">As a Business Analyst, I worked at Embafinans for one year, delivering four production projects, and before that at Birbonus, where I designed the payment and refund flow with bonuses.</w:t>
       </w:r>
     </w:p>
     <w:p>
@@ -131,7 +131,7 @@
           <w:sz w:val="22"/>
           <w:szCs w:val="22"/>
         </w:rPr>
-        <w:t xml:space="preserve">My software engineering background helps me write requirements that developers understand without extra questions. At Embafinans, I reached concrete results: the credit scoring system I documented became 50% faster, the digital sales channel I specified handles 300 to 500 applications every day, and the delivery tracking dashboard I coordinated cut mistakes by half. At Birbonus, I managed requirements for many partner companies where customers, merchants, and payments all had to work together, and this is the same kind of coordination that e-commerce needs.</w:t>
+        <w:t xml:space="preserve">My software engineering background includes large projects like the Government Payment Portal at the Central Bank and the MobilBank application at Unibank, where I also built omnichannel solutions that let customers start on one channel and continue from another, as well as payment gateway integrations. This background helps me write requirements that developers understand without extra questions. At Embafinans, I reached concrete results: the credit scoring system I documented makes lending decisions 50% faster, the digital sales channel I specified handles 300 to 500 loan applications every day, and the delivery tracking dashboard I coordinated cut operational mistakes by half.</w:t>
       </w:r>
     </w:p>
     <w:p>

</xml_diff>

<commit_message>
V13 Cover Letter: team context, communication, full SDLC cycle, cohesive rewrite
</commit_message>
<xml_diff>
--- a/Zamir_Jamalov_Cover_Letter_Kontakt_Home.docx
+++ b/Zamir_Jamalov_Cover_Letter_Kontakt_Home.docx
@@ -116,7 +116,7 @@
           <w:sz w:val="22"/>
           <w:szCs w:val="22"/>
         </w:rPr>
-        <w:t xml:space="preserve">As a Business Analyst, I worked at Embafinans for one year, delivering four production projects, and before that at Birbonus, where I designed the payment and refund flow with bonuses.</w:t>
+        <w:t xml:space="preserve">As a Business Analyst, I worked at Embafinans for one year, delivering four production projects, and before that at Birbonus, where I designed the payment and refund flow with bonuses. In both roles, I worked closely with developers, testers, and business teams, managing the full project cycle from the first analysis to release and ongoing monitoring.</w:t>
       </w:r>
     </w:p>
     <w:p>
@@ -131,7 +131,7 @@
           <w:sz w:val="22"/>
           <w:szCs w:val="22"/>
         </w:rPr>
-        <w:t xml:space="preserve">My software engineering background includes large projects like the Government Payment Portal at the Central Bank and the MobilBank application at Unibank, where I also built omnichannel solutions that let customers start on one channel and continue from another, as well as payment gateway integrations. This background helps me write requirements that developers understand without extra questions. At Embafinans, I reached concrete results: the credit scoring system I documented makes lending decisions 50% faster, the digital sales channel I specified handles 300 to 500 loan applications every day, and the delivery tracking dashboard I coordinated cut operational mistakes by half.</w:t>
+        <w:t xml:space="preserve">My software engineering background includes large projects like the Government Payment Portal at the Central Bank and the MobilBank application at Unibank, where I also built omnichannel solutions that let customers start on one channel and continue from another, as well as payment gateway integrations. This background helps me write requirements that developers understand without extra questions. Together with the teams at Embafinans, we achieved concrete results: the credit scoring system now makes lending decisions 50% faster, the digital sales channel handles 300 to 500 loan applications every day, and the delivery tracking dashboard cut operational mistakes by half.</w:t>
       </w:r>
     </w:p>
     <w:p>

</xml_diff>

<commit_message>
V15 Cover Letter: contribute value, reliable systems + large teams + process documentation, cohesive flow
</commit_message>
<xml_diff>
--- a/Zamir_Jamalov_Cover_Letter_Kontakt_Home.docx
+++ b/Zamir_Jamalov_Cover_Letter_Kontakt_Home.docx
@@ -101,7 +101,7 @@
           <w:sz w:val="22"/>
           <w:szCs w:val="22"/>
         </w:rPr>
-        <w:t xml:space="preserve">I am applying for the Business Analyst (E-Commerce) position at Kontakt Home. As the leading home appliance retailer in Azerbaijan, Kontakt Home is growing fast in digital, and I would like to be part of that growth.</w:t>
+        <w:t xml:space="preserve">I am applying for the Business Analyst (E-Commerce) position at Kontakt Home. As the leading home appliance retailer in Azerbaijan, Kontakt Home is growing fast in digital, and I would like to contribute to that growth with my experience.</w:t>
       </w:r>
     </w:p>
     <w:p>
@@ -131,7 +131,7 @@
           <w:sz w:val="22"/>
           <w:szCs w:val="22"/>
         </w:rPr>
-        <w:t xml:space="preserve">Before becoming a BA, I worked as a software engineer on large projects like the Government Payment Portal and MobilBank. That experience gave me two things that help me now: first, I understand omnichannel systems and payment gateways from the inside, and second, I can write requirements that developers understand without extra questions. Together with the teams at Embafinans, this led to concrete results: the credit scoring system now makes lending decisions 50% faster, the digital sales channel handles 300 to 500 loan applications every day, and the delivery tracking dashboard cut operational mistakes by half.</w:t>
+        <w:t xml:space="preserve">Before becoming a BA, I worked as a software engineer on large projects like the Government Payment Portal and MobilBank. That experience taught me how to build reliable systems, work with large teams, and document processes clearly, skills that I now use every day as a Business Analyst. It also gave me a deep understanding of omnichannel solutions and payment gateways. Together with the teams at Embafinans, we achieved concrete results: the credit scoring system now makes lending decisions 50% faster, the digital sales channel handles 300 to 500 loan applications every day, and the delivery tracking dashboard cut operational mistakes by half.</w:t>
       </w:r>
     </w:p>
     <w:p>

</xml_diff>

<commit_message>
V16 Cover Letter: clean structure - BA+results in P2, engineering background in P3, no repetition
</commit_message>
<xml_diff>
--- a/Zamir_Jamalov_Cover_Letter_Kontakt_Home.docx
+++ b/Zamir_Jamalov_Cover_Letter_Kontakt_Home.docx
@@ -116,7 +116,7 @@
           <w:sz w:val="22"/>
           <w:szCs w:val="22"/>
         </w:rPr>
-        <w:t xml:space="preserve">As a Business Analyst, I worked at Embafinans for one year, delivering four production projects, and before that at Birbonus, where I designed the payment and refund flow with bonuses. In both roles, I worked closely with developers, testers, and business teams, managing the full project cycle from the first analysis to release and ongoing monitoring.</w:t>
+        <w:t xml:space="preserve">As a Business Analyst, I worked at Embafinans for one year, delivering four production projects, and before that at Birbonus, where I designed the payment and refund flow with bonuses. In both roles, I worked closely with developers, testers, and business teams, managing the full project cycle from the first analysis to release and ongoing monitoring. Together with these teams, we achieved concrete results: the credit scoring system now makes lending decisions 50% faster, the digital sales channel handles 300 to 500 loan applications every day, and the delivery tracking dashboard cut operational mistakes by half.</w:t>
       </w:r>
     </w:p>
     <w:p>
@@ -131,7 +131,7 @@
           <w:sz w:val="22"/>
           <w:szCs w:val="22"/>
         </w:rPr>
-        <w:t xml:space="preserve">Before becoming a BA, I worked as a software engineer on large projects like the Government Payment Portal and MobilBank. That experience taught me how to build reliable systems, work with large teams, and document processes clearly, skills that I now use every day as a Business Analyst. It also gave me a deep understanding of omnichannel solutions and payment gateways. Together with the teams at Embafinans, we achieved concrete results: the credit scoring system now makes lending decisions 50% faster, the digital sales channel handles 300 to 500 loan applications every day, and the delivery tracking dashboard cut operational mistakes by half.</w:t>
+        <w:t xml:space="preserve">Before becoming a BA, I worked as a software engineer on large projects like the Government Payment Portal and MobilBank. That experience taught me how to build reliable systems, work with large teams, and document processes clearly, skills that I now use every day. It also gave me a deep understanding of omnichannel solutions and payment gateways from the inside.</w:t>
       </w:r>
     </w:p>
     <w:p>

</xml_diff>